<commit_message>
commeted the my evidence
</commit_message>
<xml_diff>
--- a/gardah_checkpoint1_s12026.docx
+++ b/gardah_checkpoint1_s12026.docx
@@ -94,6 +94,32 @@
           <w:rFonts w:ascii="Arial" w:hAnsi="Arial" w:cs="Arial"/>
         </w:rPr>
       </w:pPr>
+      <w:r>
+        <w:rPr>
+          <w:rFonts w:ascii="Arial" w:hAnsi="Arial" w:cs="Arial"/>
+        </w:rPr>
+        <w:t xml:space="preserve">The </w:t>
+      </w:r>
+      <w:proofErr w:type="spellStart"/>
+      <w:r>
+        <w:rPr>
+          <w:rFonts w:ascii="Arial" w:hAnsi="Arial" w:cs="Arial"/>
+        </w:rPr>
+        <w:t>ip</w:t>
+      </w:r>
+      <w:proofErr w:type="spellEnd"/>
+      <w:r>
+        <w:rPr>
+          <w:rFonts w:ascii="Arial" w:hAnsi="Arial" w:cs="Arial"/>
+        </w:rPr>
+        <w:t xml:space="preserve"> address is 20.211.97.202 and its running </w:t>
+      </w:r>
+      <w:r>
+        <w:rPr>
+          <w:rFonts w:ascii="Arial" w:hAnsi="Arial" w:cs="Arial"/>
+        </w:rPr>
+        <w:t>ubuntu </w:t>
+      </w:r>
     </w:p>
     <w:p>
       <w:pPr>
@@ -166,7 +192,56 @@
         <w:rPr>
           <w:rFonts w:ascii="Arial" w:hAnsi="Arial" w:cs="Arial"/>
         </w:rPr>
-        <w:t>□ The usermod, groupmod, and home directory move commands with their output</w:t>
+        <w:t xml:space="preserve">I ssh into the server with the username </w:t>
+      </w:r>
+      <w:proofErr w:type="spellStart"/>
+      <w:r>
+        <w:rPr>
+          <w:rFonts w:ascii="Arial" w:hAnsi="Arial" w:cs="Arial"/>
+        </w:rPr>
+        <w:t>oscstudent</w:t>
+      </w:r>
+      <w:proofErr w:type="spellEnd"/>
+    </w:p>
+    <w:p>
+      <w:pPr>
+        <w:rPr>
+          <w:rFonts w:ascii="Arial" w:hAnsi="Arial" w:cs="Arial"/>
+        </w:rPr>
+      </w:pPr>
+      <w:r>
+        <w:rPr>
+          <w:rFonts w:ascii="Arial" w:hAnsi="Arial" w:cs="Arial"/>
+        </w:rPr>
+        <w:t xml:space="preserve">□ The </w:t>
+      </w:r>
+      <w:proofErr w:type="spellStart"/>
+      <w:r>
+        <w:rPr>
+          <w:rFonts w:ascii="Arial" w:hAnsi="Arial" w:cs="Arial"/>
+        </w:rPr>
+        <w:t>usermod</w:t>
+      </w:r>
+      <w:proofErr w:type="spellEnd"/>
+      <w:r>
+        <w:rPr>
+          <w:rFonts w:ascii="Arial" w:hAnsi="Arial" w:cs="Arial"/>
+        </w:rPr>
+        <w:t xml:space="preserve">, </w:t>
+      </w:r>
+      <w:proofErr w:type="spellStart"/>
+      <w:r>
+        <w:rPr>
+          <w:rFonts w:ascii="Arial" w:hAnsi="Arial" w:cs="Arial"/>
+        </w:rPr>
+        <w:t>groupmod</w:t>
+      </w:r>
+      <w:proofErr w:type="spellEnd"/>
+      <w:r>
+        <w:rPr>
+          <w:rFonts w:ascii="Arial" w:hAnsi="Arial" w:cs="Arial"/>
+        </w:rPr>
+        <w:t>, and home directory move commands with their output</w:t>
       </w:r>
     </w:p>
     <w:p>
@@ -227,7 +302,48 @@
         <w:rPr>
           <w:rFonts w:ascii="Arial" w:hAnsi="Arial" w:cs="Arial"/>
         </w:rPr>
-        <w:t>□ Output of id &lt;yourusername&gt; and ls -la /home/ confirming the rename</w:t>
+        <w:t xml:space="preserve">First renamed the user </w:t>
+      </w:r>
+      <w:proofErr w:type="spellStart"/>
+      <w:r>
+        <w:rPr>
+          <w:rFonts w:ascii="Arial" w:hAnsi="Arial" w:cs="Arial"/>
+        </w:rPr>
+        <w:t>oscstudent</w:t>
+      </w:r>
+      <w:proofErr w:type="spellEnd"/>
+      <w:r>
+        <w:rPr>
+          <w:rFonts w:ascii="Arial" w:hAnsi="Arial" w:cs="Arial"/>
+        </w:rPr>
+        <w:t xml:space="preserve"> to albertg1 then created the home directory then switched user to the renamed user</w:t>
+      </w:r>
+    </w:p>
+    <w:p>
+      <w:pPr>
+        <w:rPr>
+          <w:rFonts w:ascii="Arial" w:hAnsi="Arial" w:cs="Arial"/>
+        </w:rPr>
+      </w:pPr>
+      <w:r>
+        <w:rPr>
+          <w:rFonts w:ascii="Arial" w:hAnsi="Arial" w:cs="Arial"/>
+        </w:rPr>
+        <w:t>□ Output of id &lt;</w:t>
+      </w:r>
+      <w:proofErr w:type="spellStart"/>
+      <w:r>
+        <w:rPr>
+          <w:rFonts w:ascii="Arial" w:hAnsi="Arial" w:cs="Arial"/>
+        </w:rPr>
+        <w:t>yourusername</w:t>
+      </w:r>
+      <w:proofErr w:type="spellEnd"/>
+      <w:r>
+        <w:rPr>
+          <w:rFonts w:ascii="Arial" w:hAnsi="Arial" w:cs="Arial"/>
+        </w:rPr>
+        <w:t>&gt; and ls -la /home/ confirming the rename</w:t>
       </w:r>
     </w:p>
     <w:p>
@@ -289,6 +405,63 @@
         <w:rPr>
           <w:rFonts w:ascii="Arial" w:hAnsi="Arial" w:cs="Arial"/>
         </w:rPr>
+        <w:t xml:space="preserve">Show the user is in the albertg1, </w:t>
+      </w:r>
+      <w:proofErr w:type="spellStart"/>
+      <w:r>
+        <w:rPr>
+          <w:rFonts w:ascii="Arial" w:hAnsi="Arial" w:cs="Arial"/>
+        </w:rPr>
+        <w:t>adm</w:t>
+      </w:r>
+      <w:proofErr w:type="spellEnd"/>
+      <w:r>
+        <w:rPr>
+          <w:rFonts w:ascii="Arial" w:hAnsi="Arial" w:cs="Arial"/>
+        </w:rPr>
+        <w:t xml:space="preserve">, </w:t>
+      </w:r>
+      <w:proofErr w:type="spellStart"/>
+      <w:proofErr w:type="gramStart"/>
+      <w:r>
+        <w:rPr>
+          <w:rFonts w:ascii="Arial" w:hAnsi="Arial" w:cs="Arial"/>
+        </w:rPr>
+        <w:t>cdron,sudo</w:t>
+      </w:r>
+      <w:proofErr w:type="gramEnd"/>
+      <w:r>
+        <w:rPr>
+          <w:rFonts w:ascii="Arial" w:hAnsi="Arial" w:cs="Arial"/>
+        </w:rPr>
+        <w:t>,</w:t>
+      </w:r>
+      <w:proofErr w:type="gramStart"/>
+      <w:r>
+        <w:rPr>
+          <w:rFonts w:ascii="Arial" w:hAnsi="Arial" w:cs="Arial"/>
+        </w:rPr>
+        <w:t>dip,lxd</w:t>
+      </w:r>
+      <w:proofErr w:type="spellEnd"/>
+      <w:proofErr w:type="gramEnd"/>
+      <w:r>
+        <w:rPr>
+          <w:rFonts w:ascii="Arial" w:hAnsi="Arial" w:cs="Arial"/>
+        </w:rPr>
+        <w:t xml:space="preserve"> groups and has execute perms </w:t>
+      </w:r>
+    </w:p>
+    <w:p>
+      <w:pPr>
+        <w:rPr>
+          <w:rFonts w:ascii="Arial" w:hAnsi="Arial" w:cs="Arial"/>
+        </w:rPr>
+      </w:pPr>
+      <w:r>
+        <w:rPr>
+          <w:rFonts w:ascii="Arial" w:hAnsi="Arial" w:cs="Arial"/>
+        </w:rPr>
         <w:t>□ Evidence of successful password change (do not show the actual password</w:t>
       </w:r>
       <w:r>
@@ -359,6 +532,26 @@
           <w:rFonts w:ascii="Arial" w:hAnsi="Arial" w:cs="Arial"/>
         </w:rPr>
       </w:pPr>
+      <w:r>
+        <w:rPr>
+          <w:rFonts w:ascii="Arial" w:hAnsi="Arial" w:cs="Arial"/>
+        </w:rPr>
+        <w:t xml:space="preserve">Used </w:t>
+      </w:r>
+      <w:proofErr w:type="spellStart"/>
+      <w:r>
+        <w:rPr>
+          <w:rFonts w:ascii="Arial" w:hAnsi="Arial" w:cs="Arial"/>
+        </w:rPr>
+        <w:t>sudo</w:t>
+      </w:r>
+      <w:proofErr w:type="spellEnd"/>
+      <w:r>
+        <w:rPr>
+          <w:rFonts w:ascii="Arial" w:hAnsi="Arial" w:cs="Arial"/>
+        </w:rPr>
+        <w:t xml:space="preserve"> passwd to change password</w:t>
+      </w:r>
     </w:p>
     <w:p>
       <w:pPr>
@@ -391,22 +584,17 @@
         </w:rPr>
         <w:t xml:space="preserve"> the complete script with inline comments</w:t>
       </w:r>
-      <w:r>
-        <w:rPr>
-          <w:rFonts w:ascii="Arial" w:hAnsi="Arial" w:cs="Arial"/>
-        </w:rPr>
-        <w:t>\</w:t>
-      </w:r>
-    </w:p>
-    <w:p>
-      <w:pPr>
-        <w:rPr>
-          <w:rFonts w:ascii="Arial" w:hAnsi="Arial" w:cs="Arial"/>
-        </w:rPr>
-      </w:pPr>
-      <w:r>
-        <w:rPr>
-          <w:rFonts w:ascii="Arial" w:hAnsi="Arial" w:cs="Arial"/>
+    </w:p>
+    <w:p>
+      <w:pPr>
+        <w:rPr>
+          <w:rFonts w:ascii="Arial" w:hAnsi="Arial" w:cs="Arial"/>
+        </w:rPr>
+      </w:pPr>
+      <w:r>
+        <w:rPr>
+          <w:rFonts w:ascii="Arial" w:hAnsi="Arial" w:cs="Arial"/>
+          <w:noProof/>
         </w:rPr>
         <w:drawing>
           <wp:inline distT="0" distB="0" distL="0" distR="0" wp14:anchorId="45931A07" wp14:editId="4D84589D">
@@ -454,6 +642,20 @@
       <w:r>
         <w:rPr>
           <w:rFonts w:ascii="Arial" w:hAnsi="Arial" w:cs="Arial"/>
+        </w:rPr>
+        <w:t>This is setting up the log filer and validating the username and that it is running with the root privilege</w:t>
+      </w:r>
+    </w:p>
+    <w:p>
+      <w:pPr>
+        <w:rPr>
+          <w:rFonts w:ascii="Arial" w:hAnsi="Arial" w:cs="Arial"/>
+        </w:rPr>
+      </w:pPr>
+      <w:r>
+        <w:rPr>
+          <w:rFonts w:ascii="Arial" w:hAnsi="Arial" w:cs="Arial"/>
+          <w:noProof/>
         </w:rPr>
         <w:lastRenderedPageBreak/>
         <w:drawing>
@@ -512,6 +714,40 @@
         <w:rPr>
           <w:rFonts w:ascii="Arial" w:hAnsi="Arial" w:cs="Arial"/>
         </w:rPr>
+        <w:t xml:space="preserve">Creates the base directory </w:t>
+      </w:r>
+      <w:r>
+        <w:rPr>
+          <w:rFonts w:ascii="Arial" w:hAnsi="Arial" w:cs="Arial"/>
+        </w:rPr>
+        <w:t xml:space="preserve">loops through </w:t>
+      </w:r>
+      <w:proofErr w:type="gramStart"/>
+      <w:r>
+        <w:rPr>
+          <w:rFonts w:ascii="Arial" w:hAnsi="Arial" w:cs="Arial"/>
+        </w:rPr>
+        <w:t>all of</w:t>
+      </w:r>
+      <w:proofErr w:type="gramEnd"/>
+      <w:r>
+        <w:rPr>
+          <w:rFonts w:ascii="Arial" w:hAnsi="Arial" w:cs="Arial"/>
+        </w:rPr>
+        <w:t xml:space="preserve"> the lines of the csv file and spits them on a comma trims the fields dose some validation </w:t>
+      </w:r>
+    </w:p>
+    <w:p>
+      <w:pPr>
+        <w:rPr>
+          <w:rFonts w:ascii="Arial" w:hAnsi="Arial" w:cs="Arial"/>
+        </w:rPr>
+      </w:pPr>
+      <w:r>
+        <w:rPr>
+          <w:rFonts w:ascii="Arial" w:hAnsi="Arial" w:cs="Arial"/>
+          <w:noProof/>
+        </w:rPr>
         <w:lastRenderedPageBreak/>
         <w:drawing>
           <wp:inline distT="0" distB="0" distL="0" distR="0" wp14:anchorId="70DC257C" wp14:editId="371A2D17">
@@ -560,6 +796,33 @@
         <w:rPr>
           <w:rFonts w:ascii="Arial" w:hAnsi="Arial" w:cs="Arial"/>
         </w:rPr>
+        <w:t>Creates the user and the group if they already exist update them</w:t>
+      </w:r>
+    </w:p>
+    <w:p>
+      <w:pPr>
+        <w:rPr>
+          <w:rFonts w:ascii="Arial" w:hAnsi="Arial" w:cs="Arial"/>
+        </w:rPr>
+      </w:pPr>
+      <w:r>
+        <w:rPr>
+          <w:rFonts w:ascii="Arial" w:hAnsi="Arial" w:cs="Arial"/>
+        </w:rPr>
+        <w:t>Adds the user to the group and ensures the user has access to their home directory</w:t>
+      </w:r>
+    </w:p>
+    <w:p>
+      <w:pPr>
+        <w:rPr>
+          <w:rFonts w:ascii="Arial" w:hAnsi="Arial" w:cs="Arial"/>
+        </w:rPr>
+      </w:pPr>
+      <w:r>
+        <w:rPr>
+          <w:rFonts w:ascii="Arial" w:hAnsi="Arial" w:cs="Arial"/>
+          <w:noProof/>
+        </w:rPr>
         <w:drawing>
           <wp:inline distT="0" distB="0" distL="0" distR="0" wp14:anchorId="5C1DCBAE" wp14:editId="76D25EC9">
             <wp:extent cx="4500000" cy="1741469"/>
@@ -607,7 +870,34 @@
         <w:rPr>
           <w:rFonts w:ascii="Arial" w:hAnsi="Arial" w:cs="Arial"/>
         </w:rPr>
-        <w:t>□ Screenshot: running the script (sudo bash onboard_users.sh) showing output</w:t>
+        <w:t xml:space="preserve">Gives the user permissions </w:t>
+      </w:r>
+    </w:p>
+    <w:p>
+      <w:pPr>
+        <w:rPr>
+          <w:rFonts w:ascii="Arial" w:hAnsi="Arial" w:cs="Arial"/>
+        </w:rPr>
+      </w:pPr>
+      <w:r>
+        <w:rPr>
+          <w:rFonts w:ascii="Arial" w:hAnsi="Arial" w:cs="Arial"/>
+        </w:rPr>
+        <w:t>□ Screenshot: running the script (</w:t>
+      </w:r>
+      <w:proofErr w:type="spellStart"/>
+      <w:r>
+        <w:rPr>
+          <w:rFonts w:ascii="Arial" w:hAnsi="Arial" w:cs="Arial"/>
+        </w:rPr>
+        <w:t>sudo</w:t>
+      </w:r>
+      <w:proofErr w:type="spellEnd"/>
+      <w:r>
+        <w:rPr>
+          <w:rFonts w:ascii="Arial" w:hAnsi="Arial" w:cs="Arial"/>
+        </w:rPr>
+        <w:t xml:space="preserve"> bash onboard_users.sh) showing output</w:t>
       </w:r>
     </w:p>
     <w:p>
@@ -632,6 +922,7 @@
       <w:r>
         <w:rPr>
           <w:rFonts w:ascii="Arial" w:hAnsi="Arial" w:cs="Arial"/>
+          <w:noProof/>
         </w:rPr>
         <w:lastRenderedPageBreak/>
         <w:drawing>
@@ -681,6 +972,19 @@
         <w:rPr>
           <w:rFonts w:ascii="Arial" w:hAnsi="Arial" w:cs="Arial"/>
         </w:rPr>
+        <w:t>Evidence of the script onboard users running</w:t>
+      </w:r>
+    </w:p>
+    <w:p>
+      <w:pPr>
+        <w:rPr>
+          <w:rFonts w:ascii="Arial" w:hAnsi="Arial" w:cs="Arial"/>
+        </w:rPr>
+      </w:pPr>
+      <w:r>
+        <w:rPr>
+          <w:rFonts w:ascii="Arial" w:hAnsi="Arial" w:cs="Arial"/>
+        </w:rPr>
         <w:t>□ Screenshot: contents of /var/log/user_onboarding_audit.log showing times-</w:t>
       </w:r>
     </w:p>
@@ -706,6 +1010,7 @@
       <w:r>
         <w:rPr>
           <w:rFonts w:ascii="Arial" w:hAnsi="Arial" w:cs="Arial"/>
+          <w:noProof/>
         </w:rPr>
         <w:drawing>
           <wp:inline distT="0" distB="0" distL="0" distR="0" wp14:anchorId="4B01C6E1" wp14:editId="6CEDEA18">
@@ -754,6 +1059,19 @@
         <w:rPr>
           <w:rFonts w:ascii="Arial" w:hAnsi="Arial" w:cs="Arial"/>
         </w:rPr>
+        <w:t xml:space="preserve">Shows the log files with time stamps </w:t>
+      </w:r>
+    </w:p>
+    <w:p>
+      <w:pPr>
+        <w:rPr>
+          <w:rFonts w:ascii="Arial" w:hAnsi="Arial" w:cs="Arial"/>
+        </w:rPr>
+      </w:pPr>
+      <w:r>
+        <w:rPr>
+          <w:rFonts w:ascii="Arial" w:hAnsi="Arial" w:cs="Arial"/>
+        </w:rPr>
         <w:t>□ Screenshot: id &lt;username&gt; and ls -la /home/ /opt/projects/ confirming</w:t>
       </w:r>
     </w:p>
@@ -779,7 +1097,9 @@
       <w:r>
         <w:rPr>
           <w:rFonts w:ascii="Arial" w:hAnsi="Arial" w:cs="Arial"/>
-        </w:rPr>
+          <w:noProof/>
+        </w:rPr>
+        <w:lastRenderedPageBreak/>
         <w:drawing>
           <wp:inline distT="0" distB="0" distL="0" distR="0" wp14:anchorId="5FBBABD3" wp14:editId="3DBBA654">
             <wp:extent cx="5220429" cy="390580"/>
@@ -826,8 +1146,8 @@
       <w:r>
         <w:rPr>
           <w:rFonts w:ascii="Arial" w:hAnsi="Arial" w:cs="Arial"/>
-        </w:rPr>
-        <w:lastRenderedPageBreak/>
+          <w:noProof/>
+        </w:rPr>
         <w:drawing>
           <wp:inline distT="0" distB="0" distL="0" distR="0" wp14:anchorId="5139206B" wp14:editId="396C5079">
             <wp:extent cx="3390900" cy="933450"/>
@@ -884,29 +1204,8 @@
         <w:rPr>
           <w:rFonts w:ascii="Arial" w:hAnsi="Arial" w:cs="Arial"/>
         </w:rPr>
-        <w:t>□ All screenshots have descriptive captions</w:t>
-      </w:r>
-    </w:p>
-    <w:p>
-      <w:pPr>
-        <w:rPr>
-          <w:rFonts w:ascii="Arial" w:hAnsi="Arial" w:cs="Arial"/>
-        </w:rPr>
-      </w:pPr>
-    </w:p>
-    <w:p>
-      <w:pPr>
-        <w:rPr>
-          <w:rFonts w:ascii="Arial" w:hAnsi="Arial" w:cs="Arial"/>
-        </w:rPr>
-      </w:pPr>
-    </w:p>
-    <w:p>
-      <w:pPr>
-        <w:rPr>
-          <w:rFonts w:ascii="Arial" w:hAnsi="Arial" w:cs="Arial"/>
-        </w:rPr>
-      </w:pPr>
+        <w:t xml:space="preserve"> The users were created successfully</w:t>
+      </w:r>
     </w:p>
     <w:p>
       <w:pPr>
@@ -942,6 +1241,7 @@
       <w:r>
         <w:rPr>
           <w:rFonts w:ascii="Arial" w:hAnsi="Arial" w:cs="Arial"/>
+          <w:noProof/>
         </w:rPr>
         <w:lastRenderedPageBreak/>
         <w:drawing>
@@ -1015,6 +1315,7 @@
       <w:r>
         <w:rPr>
           <w:rFonts w:ascii="Arial" w:hAnsi="Arial" w:cs="Arial"/>
+          <w:noProof/>
         </w:rPr>
         <w:lastRenderedPageBreak/>
         <w:drawing>
@@ -1064,6 +1365,19 @@
         <w:rPr>
           <w:rFonts w:ascii="Arial" w:hAnsi="Arial" w:cs="Arial"/>
         </w:rPr>
+        <w:t>shows the 10n critical errors</w:t>
+      </w:r>
+    </w:p>
+    <w:p>
+      <w:pPr>
+        <w:rPr>
+          <w:rFonts w:ascii="Arial" w:hAnsi="Arial" w:cs="Arial"/>
+        </w:rPr>
+      </w:pPr>
+      <w:r>
+        <w:rPr>
+          <w:rFonts w:ascii="Arial" w:hAnsi="Arial" w:cs="Arial"/>
+        </w:rPr>
         <w:t>□ Screenshot: terminal showing the top 10 token output when the script is run</w:t>
       </w:r>
     </w:p>
@@ -1076,6 +1390,7 @@
       <w:r>
         <w:rPr>
           <w:rFonts w:ascii="Arial" w:hAnsi="Arial" w:cs="Arial"/>
+          <w:noProof/>
         </w:rPr>
         <w:drawing>
           <wp:inline distT="0" distB="0" distL="0" distR="0" wp14:anchorId="3021E15D" wp14:editId="193607C4">

</xml_diff>